<commit_message>
Update project intro with team's edited version
</commit_message>
<xml_diff>
--- a/docs/presentation/2026ESWContest_모빌리티_두고내리지말아조_작품소개서.docx
+++ b/docs/presentation/2026ESWContest_모빌리티_두고내리지말아조_작품소개서.docx
@@ -10,11 +10,11 @@
         <w:tblLook w:val="04A0" w:firstRow="1" w:lastRow="0" w:firstColumn="1" w:lastColumn="0" w:noHBand="0" w:noVBand="1"/>
       </w:tblPr>
       <w:tblGrid>
-        <w:gridCol w:w="2581"/>
-        <w:gridCol w:w="817"/>
-        <w:gridCol w:w="1496"/>
-        <w:gridCol w:w="2042"/>
-        <w:gridCol w:w="1972"/>
+        <w:gridCol w:w="2597"/>
+        <w:gridCol w:w="816"/>
+        <w:gridCol w:w="1492"/>
+        <w:gridCol w:w="2035"/>
+        <w:gridCol w:w="1968"/>
       </w:tblGrid>
       <w:tr>
         <w:trPr>
@@ -102,42 +102,7 @@
             </w:pPr>
             <w:r>
               <w:rPr>
-                <w:rFonts w:ascii="나눔명조" w:eastAsia="나눔명조" w:hAnsi="나눔명조" w:cs="KoPubWorld바탕체 Medium" w:hint="eastAsia"/>
-                <w:color w:val="0000FF"/>
-                <w:sz w:val="32"/>
-                <w:szCs w:val="32"/>
-              </w:rPr>
-            </w:r>
-            <w:proofErr w:type="spellStart"/>
-            <w:r>
-              <w:rPr>
-                <w:rFonts w:ascii="나눔명조" w:eastAsia="나눔명조" w:hAnsi="나눔명조" w:cs="KoPubWorld바탕체 Medium" w:hint="eastAsia"/>
-                <w:color w:val="0000FF"/>
-                <w:sz w:val="32"/>
-                <w:szCs w:val="32"/>
-              </w:rPr>
-            </w:r>
-            <w:r>
-              <w:rPr>
-                <w:rFonts w:ascii="나눔명조" w:eastAsia="나눔명조" w:hAnsi="나눔명조" w:cs="KoPubWorld바탕체 Medium" w:hint="eastAsia"/>
-                <w:color w:val="0000FF"/>
-                <w:sz w:val="32"/>
-                <w:szCs w:val="32"/>
-              </w:rPr>
-            </w:r>
-            <w:proofErr w:type="spellEnd"/>
-            <w:r>
-              <w:rPr>
-                <w:rFonts w:ascii="나눔명조" w:eastAsia="나눔명조" w:hAnsi="나눔명조" w:cs="KoPubWorld바탕체 Medium" w:hint="eastAsia"/>
-                <w:color w:val="0000FF"/>
-                <w:sz w:val="32"/>
-                <w:szCs w:val="32"/>
-              </w:rPr>
-            </w:r>
-            <w:r>
-              <w:rPr>
-                <w:rFonts w:ascii="나눔명조" w:hAnsi="나눔명조" w:eastAsia="나눔명조" w:cs="나눔명조"/>
-                <w:b w:val="0"/>
+                <w:rFonts w:ascii="나눔명조" w:eastAsia="나눔명조" w:hAnsi="나눔명조" w:cs="나눔명조"/>
                 <w:color w:val="000000"/>
                 <w:sz w:val="32"/>
               </w:rPr>
@@ -198,8 +163,7 @@
             </w:pPr>
             <w:r>
               <w:rPr>
-                <w:rFonts w:ascii="나눔명조" w:hAnsi="나눔명조" w:eastAsia="나눔명조" w:cs="나눔명조"/>
-                <w:b w:val="0"/>
+                <w:rFonts w:ascii="나눔명조" w:eastAsia="나눔명조" w:hAnsi="나눔명조" w:cs="나눔명조"/>
                 <w:color w:val="000000"/>
                 <w:sz w:val="22"/>
               </w:rPr>
@@ -231,7 +195,6 @@
                 <w:sz w:val="22"/>
               </w:rPr>
             </w:pPr>
-            <w:proofErr w:type="spellStart"/>
             <w:r>
               <w:rPr>
                 <w:rFonts w:ascii="나눔명조" w:eastAsia="나눔명조" w:hAnsi="나눔명조" w:cs="KoPubWorld바탕체 Medium" w:hint="eastAsia"/>
@@ -240,7 +203,6 @@
               </w:rPr>
               <w:t>작품명</w:t>
             </w:r>
-            <w:proofErr w:type="spellEnd"/>
           </w:p>
         </w:tc>
         <w:tc>
@@ -262,8 +224,7 @@
             </w:pPr>
             <w:r>
               <w:rPr>
-                <w:rFonts w:ascii="나눔명조" w:hAnsi="나눔명조" w:eastAsia="나눔명조" w:cs="나눔명조"/>
-                <w:b w:val="0"/>
+                <w:rFonts w:ascii="나눔명조" w:eastAsia="나눔명조" w:hAnsi="나눔명조" w:cs="나눔명조"/>
                 <w:color w:val="000000"/>
                 <w:sz w:val="22"/>
               </w:rPr>
@@ -295,22 +256,26 @@
               </w:rPr>
             </w:pPr>
             <w:r>
+              <w:rPr>
+                <w:noProof/>
+              </w:rPr>
               <w:drawing>
-                <wp:inline xmlns:a="http://schemas.openxmlformats.org/drawingml/2006/main" xmlns:pic="http://schemas.openxmlformats.org/drawingml/2006/picture">
+                <wp:inline distT="0" distB="0" distL="0" distR="0" wp14:anchorId="23E8255A" wp14:editId="1BEDB1A8">
                   <wp:extent cx="1512000" cy="850500"/>
+                  <wp:effectExtent l="0" t="0" r="0" b="0"/>
                   <wp:docPr id="1" name="Picture 1"/>
                   <wp:cNvGraphicFramePr>
-                    <a:graphicFrameLocks noChangeAspect="1"/>
+                    <a:graphicFrameLocks xmlns:a="http://schemas.openxmlformats.org/drawingml/2006/main" noChangeAspect="1"/>
                   </wp:cNvGraphicFramePr>
-                  <a:graphic>
+                  <a:graphic xmlns:a="http://schemas.openxmlformats.org/drawingml/2006/main">
                     <a:graphicData uri="http://schemas.openxmlformats.org/drawingml/2006/picture">
-                      <pic:pic>
+                      <pic:pic xmlns:pic="http://schemas.openxmlformats.org/drawingml/2006/picture">
                         <pic:nvPicPr>
                           <pic:cNvPr id="0" name="team.jpg"/>
                           <pic:cNvPicPr/>
                         </pic:nvPicPr>
                         <pic:blipFill>
-                          <a:blip r:embed="rId10"/>
+                          <a:blip r:embed="rId7"/>
                           <a:stretch>
                             <a:fillRect/>
                           </a:stretch>
@@ -320,7 +285,9 @@
                             <a:off x="0" y="0"/>
                             <a:ext cx="1512000" cy="850500"/>
                           </a:xfrm>
-                          <a:prstGeom prst="rect"/>
+                          <a:prstGeom prst="rect">
+                            <a:avLst/>
+                          </a:prstGeom>
                         </pic:spPr>
                       </pic:pic>
                     </a:graphicData>
@@ -477,10 +444,8 @@
             </w:pPr>
             <w:r>
               <w:rPr>
-                <w:rFonts w:ascii="나눔명조" w:hAnsi="나눔명조" w:eastAsia="나눔명조" w:cs="나눔명조"/>
-                <w:b w:val="0"/>
-                <w:color w:val="000000"/>
-                <w:sz w:val="20"/>
+                <w:rFonts w:ascii="나눔명조" w:eastAsia="나눔명조" w:hAnsi="나눔명조" w:cs="나눔명조"/>
+                <w:color w:val="000000"/>
               </w:rPr>
               <w:t>팀장</w:t>
             </w:r>
@@ -501,10 +466,8 @@
             </w:pPr>
             <w:r>
               <w:rPr>
-                <w:rFonts w:ascii="나눔명조" w:hAnsi="나눔명조" w:eastAsia="나눔명조" w:cs="나눔명조"/>
-                <w:b w:val="0"/>
-                <w:color w:val="000000"/>
-                <w:sz w:val="20"/>
+                <w:rFonts w:ascii="나눔명조" w:eastAsia="나눔명조" w:hAnsi="나눔명조" w:cs="나눔명조"/>
+                <w:color w:val="000000"/>
               </w:rPr>
               <w:t>윤현서</w:t>
             </w:r>
@@ -519,27 +482,16 @@
             <w:pPr>
               <w:jc w:val="center"/>
               <w:rPr>
-                <w:rFonts w:ascii="나눔명조" w:eastAsia="나눔명조" w:hAnsi="나눔명조" w:cs="KoPubWorld바탕체 Medium"/>
-                <w:sz w:val="22"/>
-              </w:rPr>
-            </w:pPr>
-            <w:r>
-              <w:rPr>
-                <w:rFonts w:ascii="나눔명조" w:hAnsi="나눔명조" w:eastAsia="나눔명조" w:cs="나눔명조"/>
-                <w:b w:val="0"/>
-                <w:color w:val="000000"/>
-                <w:sz w:val="20"/>
-              </w:rPr>
-              <w:t xml:space="preserve">이화여자대학교 </w:t>
-            </w:r>
-            <w:r>
-              <w:rPr>
-                <w:rFonts w:ascii="나눔명조" w:hAnsi="나눔명조" w:eastAsia="나눔명조" w:cs="나눔명조"/>
-                <w:b w:val="0"/>
-                <w:color w:val="C00000"/>
-                <w:sz w:val="20"/>
-              </w:rPr>
-              <w:t>[학과]</w:t>
+                <w:rFonts w:ascii="나눔명조" w:eastAsia="나눔명조" w:hAnsi="나눔명조" w:cs="KoPubWorld바탕체 Medium" w:hint="eastAsia"/>
+                <w:sz w:val="22"/>
+              </w:rPr>
+            </w:pPr>
+            <w:r>
+              <w:rPr>
+                <w:rFonts w:ascii="나눔명조" w:eastAsia="나눔명조" w:hAnsi="나눔명조" w:cs="나눔명조"/>
+                <w:color w:val="000000"/>
+              </w:rPr>
+              <w:t>이화여자대학교</w:t>
             </w:r>
           </w:p>
         </w:tc>
@@ -558,10 +510,8 @@
             </w:pPr>
             <w:r>
               <w:rPr>
-                <w:rFonts w:ascii="나눔명조" w:hAnsi="나눔명조" w:eastAsia="나눔명조" w:cs="나눔명조"/>
-                <w:b w:val="0"/>
-                <w:color w:val="000000"/>
-                <w:sz w:val="20"/>
+                <w:rFonts w:ascii="나눔명조" w:eastAsia="나눔명조" w:hAnsi="나눔명조" w:cs="나눔명조"/>
+                <w:color w:val="000000"/>
               </w:rPr>
               <w:t>블록 A 전원, 구동, ESP32, 통합</w:t>
             </w:r>
@@ -611,10 +561,8 @@
             </w:pPr>
             <w:r>
               <w:rPr>
-                <w:rFonts w:ascii="나눔명조" w:hAnsi="나눔명조" w:eastAsia="나눔명조" w:cs="나눔명조"/>
-                <w:b w:val="0"/>
-                <w:color w:val="000000"/>
-                <w:sz w:val="20"/>
+                <w:rFonts w:ascii="나눔명조" w:eastAsia="나눔명조" w:hAnsi="나눔명조" w:cs="나눔명조"/>
+                <w:color w:val="000000"/>
               </w:rPr>
               <w:t>팀원</w:t>
             </w:r>
@@ -635,10 +583,8 @@
             </w:pPr>
             <w:r>
               <w:rPr>
-                <w:rFonts w:ascii="나눔명조" w:hAnsi="나눔명조" w:eastAsia="나눔명조" w:cs="나눔명조"/>
-                <w:b w:val="0"/>
-                <w:color w:val="000000"/>
-                <w:sz w:val="20"/>
+                <w:rFonts w:ascii="나눔명조" w:eastAsia="나눔명조" w:hAnsi="나눔명조" w:cs="나눔명조"/>
+                <w:color w:val="000000"/>
               </w:rPr>
               <w:t>최서현</w:t>
             </w:r>
@@ -653,28 +599,17 @@
             <w:pPr>
               <w:jc w:val="center"/>
               <w:rPr>
-                <w:rFonts w:ascii="나눔명조" w:eastAsia="나눔명조" w:hAnsi="나눔명조" w:cs="KoPubWorld바탕체 Medium"/>
-                <w:sz w:val="22"/>
-              </w:rPr>
-            </w:pPr>
-            <w:r>
-              <w:rPr>
-                <w:rFonts w:ascii="나눔명조" w:hAnsi="나눔명조" w:eastAsia="나눔명조" w:cs="나눔명조"/>
-                <w:b w:val="0"/>
-                <w:color w:val="000000"/>
-                <w:sz w:val="20"/>
+                <w:rFonts w:ascii="나눔명조" w:eastAsia="나눔명조" w:hAnsi="나눔명조" w:cs="KoPubWorld바탕체 Medium" w:hint="eastAsia"/>
+                <w:sz w:val="22"/>
+              </w:rPr>
+            </w:pPr>
+            <w:r>
+              <w:rPr>
+                <w:rFonts w:ascii="나눔명조" w:eastAsia="나눔명조" w:hAnsi="나눔명조" w:cs="나눔명조"/>
+                <w:color w:val="000000"/>
               </w:rPr>
               <w:t xml:space="preserve">이화여자대학교 </w:t>
             </w:r>
-            <w:r>
-              <w:rPr>
-                <w:rFonts w:ascii="나눔명조" w:hAnsi="나눔명조" w:eastAsia="나눔명조" w:cs="나눔명조"/>
-                <w:b w:val="0"/>
-                <w:color w:val="C00000"/>
-                <w:sz w:val="20"/>
-              </w:rPr>
-              <w:t>[학과]</w:t>
-            </w:r>
           </w:p>
         </w:tc>
         <w:tc>
@@ -692,10 +627,8 @@
             </w:pPr>
             <w:r>
               <w:rPr>
-                <w:rFonts w:ascii="나눔명조" w:hAnsi="나눔명조" w:eastAsia="나눔명조" w:cs="나눔명조"/>
-                <w:b w:val="0"/>
-                <w:color w:val="000000"/>
-                <w:sz w:val="20"/>
+                <w:rFonts w:ascii="나눔명조" w:eastAsia="나눔명조" w:hAnsi="나눔명조" w:cs="나눔명조"/>
+                <w:color w:val="000000"/>
               </w:rPr>
               <w:t>블록 C UWB 이탈 판정, 통합</w:t>
             </w:r>
@@ -744,10 +677,8 @@
             </w:pPr>
             <w:r>
               <w:rPr>
-                <w:rFonts w:ascii="나눔명조" w:hAnsi="나눔명조" w:eastAsia="나눔명조" w:cs="나눔명조"/>
-                <w:b w:val="0"/>
-                <w:color w:val="000000"/>
-                <w:sz w:val="20"/>
+                <w:rFonts w:ascii="나눔명조" w:eastAsia="나눔명조" w:hAnsi="나눔명조" w:cs="나눔명조"/>
+                <w:color w:val="000000"/>
               </w:rPr>
               <w:t>팀원</w:t>
             </w:r>
@@ -768,10 +699,8 @@
             </w:pPr>
             <w:r>
               <w:rPr>
-                <w:rFonts w:ascii="나눔명조" w:hAnsi="나눔명조" w:eastAsia="나눔명조" w:cs="나눔명조"/>
-                <w:b w:val="0"/>
-                <w:color w:val="000000"/>
-                <w:sz w:val="20"/>
+                <w:rFonts w:ascii="나눔명조" w:eastAsia="나눔명조" w:hAnsi="나눔명조" w:cs="나눔명조"/>
+                <w:color w:val="000000"/>
               </w:rPr>
               <w:t>윤홍은</w:t>
             </w:r>
@@ -786,28 +715,17 @@
             <w:pPr>
               <w:jc w:val="center"/>
               <w:rPr>
-                <w:rFonts w:ascii="나눔명조" w:eastAsia="나눔명조" w:hAnsi="나눔명조" w:cs="KoPubWorld바탕체 Medium"/>
-                <w:sz w:val="22"/>
-              </w:rPr>
-            </w:pPr>
-            <w:r>
-              <w:rPr>
-                <w:rFonts w:ascii="나눔명조" w:hAnsi="나눔명조" w:eastAsia="나눔명조" w:cs="나눔명조"/>
-                <w:b w:val="0"/>
-                <w:color w:val="000000"/>
-                <w:sz w:val="20"/>
+                <w:rFonts w:ascii="나눔명조" w:eastAsia="나눔명조" w:hAnsi="나눔명조" w:cs="KoPubWorld바탕체 Medium" w:hint="eastAsia"/>
+                <w:sz w:val="22"/>
+              </w:rPr>
+            </w:pPr>
+            <w:r>
+              <w:rPr>
+                <w:rFonts w:ascii="나눔명조" w:eastAsia="나눔명조" w:hAnsi="나눔명조" w:cs="나눔명조"/>
+                <w:color w:val="000000"/>
               </w:rPr>
               <w:t xml:space="preserve">이화여자대학교 </w:t>
             </w:r>
-            <w:r>
-              <w:rPr>
-                <w:rFonts w:ascii="나눔명조" w:hAnsi="나눔명조" w:eastAsia="나눔명조" w:cs="나눔명조"/>
-                <w:b w:val="0"/>
-                <w:color w:val="C00000"/>
-                <w:sz w:val="20"/>
-              </w:rPr>
-              <w:t>[학과]</w:t>
-            </w:r>
           </w:p>
         </w:tc>
         <w:tc>
@@ -825,10 +743,8 @@
             </w:pPr>
             <w:r>
               <w:rPr>
-                <w:rFonts w:ascii="나눔명조" w:hAnsi="나눔명조" w:eastAsia="나눔명조" w:cs="나눔명조"/>
-                <w:b w:val="0"/>
-                <w:color w:val="000000"/>
-                <w:sz w:val="20"/>
+                <w:rFonts w:ascii="나눔명조" w:eastAsia="나눔명조" w:hAnsi="나눔명조" w:cs="나눔명조"/>
+                <w:color w:val="000000"/>
               </w:rPr>
               <w:t>블록 B 레이더, 카메라, Pi 5, 시뮬레이터</w:t>
             </w:r>
@@ -854,22 +770,26 @@
               </w:rPr>
             </w:pPr>
             <w:r>
+              <w:rPr>
+                <w:noProof/>
+              </w:rPr>
               <w:drawing>
-                <wp:inline xmlns:a="http://schemas.openxmlformats.org/drawingml/2006/main" xmlns:pic="http://schemas.openxmlformats.org/drawingml/2006/picture">
+                <wp:inline distT="0" distB="0" distL="0" distR="0" wp14:anchorId="08C54A35" wp14:editId="13BC945F">
                   <wp:extent cx="2376000" cy="1782000"/>
+                  <wp:effectExtent l="0" t="0" r="0" b="0"/>
                   <wp:docPr id="2" name="Picture 2"/>
                   <wp:cNvGraphicFramePr>
-                    <a:graphicFrameLocks noChangeAspect="1"/>
+                    <a:graphicFrameLocks xmlns:a="http://schemas.openxmlformats.org/drawingml/2006/main" noChangeAspect="1"/>
                   </wp:cNvGraphicFramePr>
-                  <a:graphic>
+                  <a:graphic xmlns:a="http://schemas.openxmlformats.org/drawingml/2006/main">
                     <a:graphicData uri="http://schemas.openxmlformats.org/drawingml/2006/picture">
-                      <pic:pic>
+                      <pic:pic xmlns:pic="http://schemas.openxmlformats.org/drawingml/2006/picture">
                         <pic:nvPicPr>
                           <pic:cNvPr id="0" name="car_side_teddy.jpg"/>
                           <pic:cNvPicPr/>
                         </pic:nvPicPr>
                         <pic:blipFill>
-                          <a:blip r:embed="rId11"/>
+                          <a:blip r:embed="rId8"/>
                           <a:stretch>
                             <a:fillRect/>
                           </a:stretch>
@@ -879,7 +799,9 @@
                             <a:off x="0" y="0"/>
                             <a:ext cx="2376000" cy="1782000"/>
                           </a:xfrm>
-                          <a:prstGeom prst="rect"/>
+                          <a:prstGeom prst="rect">
+                            <a:avLst/>
+                          </a:prstGeom>
                         </pic:spPr>
                       </pic:pic>
                     </a:graphicData>
@@ -891,22 +813,26 @@
               <w:t xml:space="preserve"> </w:t>
             </w:r>
             <w:r>
+              <w:rPr>
+                <w:noProof/>
+              </w:rPr>
               <w:drawing>
-                <wp:inline xmlns:a="http://schemas.openxmlformats.org/drawingml/2006/main" xmlns:pic="http://schemas.openxmlformats.org/drawingml/2006/picture">
+                <wp:inline distT="0" distB="0" distL="0" distR="0" wp14:anchorId="4494AE11" wp14:editId="16E6ACCD">
                   <wp:extent cx="2664000" cy="1101451"/>
+                  <wp:effectExtent l="0" t="0" r="0" b="0"/>
                   <wp:docPr id="3" name="Picture 3"/>
                   <wp:cNvGraphicFramePr>
-                    <a:graphicFrameLocks noChangeAspect="1"/>
+                    <a:graphicFrameLocks xmlns:a="http://schemas.openxmlformats.org/drawingml/2006/main" noChangeAspect="1"/>
                   </wp:cNvGraphicFramePr>
-                  <a:graphic>
+                  <a:graphic xmlns:a="http://schemas.openxmlformats.org/drawingml/2006/main">
                     <a:graphicData uri="http://schemas.openxmlformats.org/drawingml/2006/picture">
-                      <pic:pic>
+                      <pic:pic xmlns:pic="http://schemas.openxmlformats.org/drawingml/2006/picture">
                         <pic:nvPicPr>
                           <pic:cNvPr id="0" name="system_diagram_crop.png"/>
                           <pic:cNvPicPr/>
                         </pic:nvPicPr>
                         <pic:blipFill>
-                          <a:blip r:embed="rId12"/>
+                          <a:blip r:embed="rId9"/>
                           <a:stretch>
                             <a:fillRect/>
                           </a:stretch>
@@ -916,7 +842,9 @@
                             <a:off x="0" y="0"/>
                             <a:ext cx="2664000" cy="1101451"/>
                           </a:xfrm>
-                          <a:prstGeom prst="rect"/>
+                          <a:prstGeom prst="rect">
+                            <a:avLst/>
+                          </a:prstGeom>
                         </pic:spPr>
                       </pic:pic>
                     </a:graphicData>
@@ -935,10 +863,8 @@
             </w:pPr>
             <w:r>
               <w:rPr>
-                <w:rFonts w:ascii="나눔명조" w:hAnsi="나눔명조" w:eastAsia="나눔명조" w:cs="나눔명조"/>
-                <w:b w:val="0"/>
-                <w:color w:val="000000"/>
-                <w:sz w:val="20"/>
+                <w:rFonts w:ascii="나눔명조" w:eastAsia="나눔명조" w:hAnsi="나눔명조" w:cs="나눔명조"/>
+                <w:color w:val="000000"/>
               </w:rPr>
               <w:t>(좌) 시연 시제품: 유아용 전동차와 인형, 운전대 앞 60 GHz 레이더   (우) 시스템 구성도</w:t>
             </w:r>
@@ -1007,7 +933,6 @@
           </w:tcPr>
           <w:p>
             <w:pPr>
-              <w:jc w:val="both"/>
               <w:rPr>
                 <w:rFonts w:ascii="나눔명조" w:eastAsia="나눔명조" w:hAnsi="나눔명조" w:cs="KoPubWorld바탕체 Medium"/>
                 <w:color w:val="0000FF"/>
@@ -1017,8 +942,7 @@
             </w:pPr>
             <w:r>
               <w:rPr>
-                <w:rFonts w:ascii="나눔명조" w:hAnsi="나눔명조" w:eastAsia="나눔명조" w:cs="나눔명조"/>
-                <w:b w:val="0"/>
+                <w:rFonts w:ascii="나눔명조" w:eastAsia="나눔명조" w:hAnsi="나눔명조" w:cs="나눔명조"/>
                 <w:color w:val="000000"/>
                 <w:sz w:val="22"/>
               </w:rPr>
@@ -1027,9 +951,8 @@
           </w:p>
           <w:p>
             <w:pPr>
-              <w:jc w:val="both"/>
-              <w:rPr>
-                <w:rFonts w:ascii="나눔명조" w:eastAsia="나눔명조" w:hAnsi="나눔명조" w:cs="KoPubWorld바탕체 Medium"/>
+              <w:rPr>
+                <w:rFonts w:ascii="나눔명조" w:eastAsia="나눔명조" w:hAnsi="나눔명조" w:cs="KoPubWorld바탕체 Medium" w:hint="eastAsia"/>
                 <w:color w:val="0000FF"/>
                 <w:sz w:val="22"/>
                 <w:shd w:val="clear" w:color="auto" w:fill="FFFFFF"/>
@@ -1037,12 +960,35 @@
             </w:pPr>
             <w:r>
               <w:rPr>
-                <w:rFonts w:ascii="나눔명조" w:hAnsi="나눔명조" w:eastAsia="나눔명조" w:cs="나눔명조"/>
-                <w:b w:val="0"/>
-                <w:color w:val="000000"/>
-                <w:sz w:val="22"/>
-              </w:rPr>
-              <w:t>보호자가 지닌 UWB 노드로 이탈(5 m 초과)을 확인하면 PIR과 카메라 → mmWave 레이더 → 온도 예측 순서로 필요한 센서만 차례로 깨우는 Cascading Wake-up 구조를 사용해, 주차 중 전력 소모를 줄이면서 움직이지 않는 탑승자까지 놓치지 않는다.</w:t>
+                <w:rFonts w:ascii="나눔명조" w:eastAsia="나눔명조" w:hAnsi="나눔명조" w:cs="나눔명조"/>
+                <w:color w:val="000000"/>
+                <w:sz w:val="22"/>
+              </w:rPr>
+              <w:t>보호자가 지닌 UWB 노드로 이탈(5 m 초과)을 확인하면 PIR과 카메라 → mmWave 레이더 → 온도 예측 순서로 필요한 센서만 차례로 깨우는 Cascading Wake-up 구조를 사용해, 주차 중 전력 소모를 줄이면서 움직이지 않는 탑승자</w:t>
+            </w:r>
+            <w:r>
+              <w:rPr>
+                <w:rFonts w:ascii="나눔명조" w:eastAsia="나눔명조" w:hAnsi="나눔명조" w:cs="나눔명조" w:hint="eastAsia"/>
+                <w:color w:val="000000"/>
+                <w:sz w:val="22"/>
+              </w:rPr>
+              <w:t>를</w:t>
+            </w:r>
+            <w:r>
+              <w:rPr>
+                <w:rFonts w:ascii="나눔명조" w:eastAsia="나눔명조" w:hAnsi="나눔명조" w:cs="나눔명조"/>
+                <w:color w:val="000000"/>
+                <w:sz w:val="22"/>
+              </w:rPr>
+              <w:t xml:space="preserve"> </w:t>
+            </w:r>
+            <w:r>
+              <w:rPr>
+                <w:rFonts w:ascii="나눔명조" w:eastAsia="나눔명조" w:hAnsi="나눔명조" w:cs="나눔명조" w:hint="eastAsia"/>
+                <w:color w:val="000000"/>
+                <w:sz w:val="22"/>
+              </w:rPr>
+              <w:t>인식한다. 이후 위험 알림을 보호자(차량 소지자)에게 보낸다.</w:t>
             </w:r>
           </w:p>
         </w:tc>
@@ -1093,7 +1039,6 @@
           </w:tcPr>
           <w:p>
             <w:pPr>
-              <w:jc w:val="both"/>
               <w:rPr>
                 <w:rFonts w:ascii="나눔명조" w:eastAsia="나눔명조" w:hAnsi="나눔명조" w:cs="KoPubWorld바탕체 Medium"/>
                 <w:color w:val="0000FF"/>
@@ -1103,7 +1048,7 @@
             </w:pPr>
             <w:r>
               <w:rPr>
-                <w:rFonts w:ascii="나눔명조" w:hAnsi="나눔명조" w:eastAsia="나눔명조" w:cs="나눔명조"/>
+                <w:rFonts w:ascii="나눔명조" w:eastAsia="나눔명조" w:hAnsi="나눔명조" w:cs="나눔명조"/>
                 <w:b/>
                 <w:color w:val="000000"/>
                 <w:sz w:val="22"/>
@@ -1112,8 +1057,7 @@
             </w:r>
             <w:r>
               <w:rPr>
-                <w:rFonts w:ascii="나눔명조" w:hAnsi="나눔명조" w:eastAsia="나눔명조" w:cs="나눔명조"/>
-                <w:b w:val="0"/>
+                <w:rFonts w:ascii="나눔명조" w:eastAsia="나눔명조" w:hAnsi="나눔명조" w:cs="나눔명조"/>
                 <w:color w:val="000000"/>
                 <w:sz w:val="22"/>
               </w:rPr>
@@ -1122,7 +1066,6 @@
           </w:p>
           <w:p>
             <w:pPr>
-              <w:jc w:val="both"/>
               <w:rPr>
                 <w:rFonts w:ascii="나눔명조" w:eastAsia="나눔명조" w:hAnsi="나눔명조" w:cs="KoPubWorld바탕체 Medium"/>
                 <w:color w:val="0000FF"/>
@@ -1132,7 +1075,7 @@
             </w:pPr>
             <w:r>
               <w:rPr>
-                <w:rFonts w:ascii="나눔명조" w:hAnsi="나눔명조" w:eastAsia="나눔명조" w:cs="나눔명조"/>
+                <w:rFonts w:ascii="나눔명조" w:eastAsia="나눔명조" w:hAnsi="나눔명조" w:cs="나눔명조"/>
                 <w:b/>
                 <w:color w:val="000000"/>
                 <w:sz w:val="22"/>
@@ -1141,8 +1084,7 @@
             </w:r>
             <w:r>
               <w:rPr>
-                <w:rFonts w:ascii="나눔명조" w:hAnsi="나눔명조" w:eastAsia="나눔명조" w:cs="나눔명조"/>
-                <w:b w:val="0"/>
+                <w:rFonts w:ascii="나눔명조" w:eastAsia="나눔명조" w:hAnsi="나눔명조" w:cs="나눔명조"/>
                 <w:color w:val="000000"/>
                 <w:sz w:val="22"/>
               </w:rPr>
@@ -1151,7 +1093,6 @@
           </w:p>
           <w:p>
             <w:pPr>
-              <w:jc w:val="both"/>
               <w:rPr>
                 <w:rFonts w:ascii="나눔명조" w:eastAsia="나눔명조" w:hAnsi="나눔명조" w:cs="KoPubWorld바탕체 Medium"/>
                 <w:color w:val="0000FF"/>
@@ -1161,7 +1102,7 @@
             </w:pPr>
             <w:r>
               <w:rPr>
-                <w:rFonts w:ascii="나눔명조" w:hAnsi="나눔명조" w:eastAsia="나눔명조" w:cs="나눔명조"/>
+                <w:rFonts w:ascii="나눔명조" w:eastAsia="나눔명조" w:hAnsi="나눔명조" w:cs="나눔명조"/>
                 <w:b/>
                 <w:color w:val="000000"/>
                 <w:sz w:val="22"/>
@@ -1170,8 +1111,7 @@
             </w:r>
             <w:r>
               <w:rPr>
-                <w:rFonts w:ascii="나눔명조" w:hAnsi="나눔명조" w:eastAsia="나눔명조" w:cs="나눔명조"/>
-                <w:b w:val="0"/>
+                <w:rFonts w:ascii="나눔명조" w:eastAsia="나눔명조" w:hAnsi="나눔명조" w:cs="나눔명조"/>
                 <w:color w:val="000000"/>
                 <w:sz w:val="22"/>
               </w:rPr>
@@ -1180,7 +1120,6 @@
           </w:p>
           <w:p>
             <w:pPr>
-              <w:jc w:val="both"/>
               <w:rPr>
                 <w:rFonts w:ascii="나눔명조" w:eastAsia="나눔명조" w:hAnsi="나눔명조" w:cs="KoPubWorld바탕체 Medium"/>
                 <w:color w:val="0000FF"/>
@@ -1190,7 +1129,7 @@
             </w:pPr>
             <w:r>
               <w:rPr>
-                <w:rFonts w:ascii="나눔명조" w:hAnsi="나눔명조" w:eastAsia="나눔명조" w:cs="나눔명조"/>
+                <w:rFonts w:ascii="나눔명조" w:eastAsia="나눔명조" w:hAnsi="나눔명조" w:cs="나눔명조"/>
                 <w:b/>
                 <w:color w:val="000000"/>
                 <w:sz w:val="22"/>
@@ -1199,8 +1138,7 @@
             </w:r>
             <w:r>
               <w:rPr>
-                <w:rFonts w:ascii="나눔명조" w:hAnsi="나눔명조" w:eastAsia="나눔명조" w:cs="나눔명조"/>
-                <w:b w:val="0"/>
+                <w:rFonts w:ascii="나눔명조" w:eastAsia="나눔명조" w:hAnsi="나눔명조" w:cs="나눔명조"/>
                 <w:color w:val="000000"/>
                 <w:sz w:val="22"/>
               </w:rPr>
@@ -1254,7 +1192,6 @@
           </w:tcPr>
           <w:p>
             <w:pPr>
-              <w:jc w:val="both"/>
               <w:rPr>
                 <w:rFonts w:ascii="나눔명조" w:eastAsia="나눔명조" w:hAnsi="나눔명조" w:cs="KoPubWorld바탕체 Medium"/>
                 <w:b/>
@@ -1264,7 +1201,7 @@
             </w:pPr>
             <w:r>
               <w:rPr>
-                <w:rFonts w:ascii="나눔명조" w:hAnsi="나눔명조" w:eastAsia="나눔명조" w:cs="나눔명조"/>
+                <w:rFonts w:ascii="나눔명조" w:eastAsia="나눔명조" w:hAnsi="나눔명조" w:cs="나눔명조"/>
                 <w:b/>
                 <w:color w:val="000000"/>
                 <w:sz w:val="22"/>
@@ -1273,8 +1210,7 @@
             </w:r>
             <w:r>
               <w:rPr>
-                <w:rFonts w:ascii="나눔명조" w:hAnsi="나눔명조" w:eastAsia="나눔명조" w:cs="나눔명조"/>
-                <w:b w:val="0"/>
+                <w:rFonts w:ascii="나눔명조" w:eastAsia="나눔명조" w:hAnsi="나눔명조" w:cs="나눔명조"/>
                 <w:color w:val="000000"/>
                 <w:sz w:val="22"/>
               </w:rPr>
@@ -1283,7 +1219,6 @@
           </w:p>
           <w:p>
             <w:pPr>
-              <w:jc w:val="both"/>
               <w:rPr>
                 <w:rFonts w:ascii="나눔명조" w:eastAsia="나눔명조" w:hAnsi="나눔명조" w:cs="KoPubWorld바탕체 Medium"/>
                 <w:b/>
@@ -1293,7 +1228,7 @@
             </w:pPr>
             <w:r>
               <w:rPr>
-                <w:rFonts w:ascii="나눔명조" w:hAnsi="나눔명조" w:eastAsia="나눔명조" w:cs="나눔명조"/>
+                <w:rFonts w:ascii="나눔명조" w:eastAsia="나눔명조" w:hAnsi="나눔명조" w:cs="나눔명조"/>
                 <w:b/>
                 <w:color w:val="000000"/>
                 <w:sz w:val="22"/>
@@ -1302,8 +1237,7 @@
             </w:r>
             <w:r>
               <w:rPr>
-                <w:rFonts w:ascii="나눔명조" w:hAnsi="나눔명조" w:eastAsia="나눔명조" w:cs="나눔명조"/>
-                <w:b w:val="0"/>
+                <w:rFonts w:ascii="나눔명조" w:eastAsia="나눔명조" w:hAnsi="나눔명조" w:cs="나눔명조"/>
                 <w:color w:val="000000"/>
                 <w:sz w:val="22"/>
               </w:rPr>
@@ -1312,7 +1246,6 @@
           </w:p>
           <w:p>
             <w:pPr>
-              <w:jc w:val="both"/>
               <w:rPr>
                 <w:rFonts w:ascii="나눔명조" w:eastAsia="나눔명조" w:hAnsi="나눔명조" w:cs="KoPubWorld바탕체 Medium"/>
                 <w:b/>
@@ -1322,7 +1255,7 @@
             </w:pPr>
             <w:r>
               <w:rPr>
-                <w:rFonts w:ascii="나눔명조" w:hAnsi="나눔명조" w:eastAsia="나눔명조" w:cs="나눔명조"/>
+                <w:rFonts w:ascii="나눔명조" w:eastAsia="나눔명조" w:hAnsi="나눔명조" w:cs="나눔명조"/>
                 <w:b/>
                 <w:color w:val="000000"/>
                 <w:sz w:val="22"/>
@@ -1331,8 +1264,7 @@
             </w:r>
             <w:r>
               <w:rPr>
-                <w:rFonts w:ascii="나눔명조" w:hAnsi="나눔명조" w:eastAsia="나눔명조" w:cs="나눔명조"/>
-                <w:b w:val="0"/>
+                <w:rFonts w:ascii="나눔명조" w:eastAsia="나눔명조" w:hAnsi="나눔명조" w:cs="나눔명조"/>
                 <w:color w:val="000000"/>
                 <w:sz w:val="22"/>
               </w:rPr>
@@ -1341,7 +1273,6 @@
           </w:p>
           <w:p>
             <w:pPr>
-              <w:jc w:val="both"/>
               <w:rPr>
                 <w:rFonts w:ascii="나눔명조" w:eastAsia="나눔명조" w:hAnsi="나눔명조" w:cs="KoPubWorld바탕체 Medium"/>
                 <w:b/>
@@ -1351,7 +1282,7 @@
             </w:pPr>
             <w:r>
               <w:rPr>
-                <w:rFonts w:ascii="나눔명조" w:hAnsi="나눔명조" w:eastAsia="나눔명조" w:cs="나눔명조"/>
+                <w:rFonts w:ascii="나눔명조" w:eastAsia="나눔명조" w:hAnsi="나눔명조" w:cs="나눔명조"/>
                 <w:b/>
                 <w:color w:val="000000"/>
                 <w:sz w:val="22"/>
@@ -1360,8 +1291,7 @@
             </w:r>
             <w:r>
               <w:rPr>
-                <w:rFonts w:ascii="나눔명조" w:hAnsi="나눔명조" w:eastAsia="나눔명조" w:cs="나눔명조"/>
-                <w:b w:val="0"/>
+                <w:rFonts w:ascii="나눔명조" w:eastAsia="나눔명조" w:hAnsi="나눔명조" w:cs="나눔명조"/>
                 <w:color w:val="000000"/>
                 <w:sz w:val="22"/>
               </w:rPr>
@@ -1370,7 +1300,6 @@
           </w:p>
           <w:p>
             <w:pPr>
-              <w:jc w:val="both"/>
               <w:rPr>
                 <w:rFonts w:ascii="나눔명조" w:eastAsia="나눔명조" w:hAnsi="나눔명조" w:cs="KoPubWorld바탕체 Medium"/>
                 <w:b/>
@@ -1380,7 +1309,7 @@
             </w:pPr>
             <w:r>
               <w:rPr>
-                <w:rFonts w:ascii="나눔명조" w:hAnsi="나눔명조" w:eastAsia="나눔명조" w:cs="나눔명조"/>
+                <w:rFonts w:ascii="나눔명조" w:eastAsia="나눔명조" w:hAnsi="나눔명조" w:cs="나눔명조"/>
                 <w:b/>
                 <w:color w:val="000000"/>
                 <w:sz w:val="22"/>
@@ -1389,8 +1318,7 @@
             </w:r>
             <w:r>
               <w:rPr>
-                <w:rFonts w:ascii="나눔명조" w:hAnsi="나눔명조" w:eastAsia="나눔명조" w:cs="나눔명조"/>
-                <w:b w:val="0"/>
+                <w:rFonts w:ascii="나눔명조" w:eastAsia="나눔명조" w:hAnsi="나눔명조" w:cs="나눔명조"/>
                 <w:color w:val="000000"/>
                 <w:sz w:val="22"/>
               </w:rPr>
@@ -1444,7 +1372,6 @@
           </w:tcPr>
           <w:p>
             <w:pPr>
-              <w:jc w:val="both"/>
               <w:rPr>
                 <w:rFonts w:ascii="나눔명조" w:eastAsia="나눔명조" w:hAnsi="나눔명조" w:cs="KoPubWorld바탕체 Medium"/>
                 <w:b/>
@@ -1454,7 +1381,7 @@
             </w:pPr>
             <w:r>
               <w:rPr>
-                <w:rFonts w:ascii="나눔명조" w:hAnsi="나눔명조" w:eastAsia="나눔명조" w:cs="나눔명조"/>
+                <w:rFonts w:ascii="나눔명조" w:eastAsia="나눔명조" w:hAnsi="나눔명조" w:cs="나눔명조"/>
                 <w:b/>
                 <w:color w:val="000000"/>
                 <w:sz w:val="22"/>
@@ -1463,8 +1390,7 @@
             </w:r>
             <w:r>
               <w:rPr>
-                <w:rFonts w:ascii="나눔명조" w:hAnsi="나눔명조" w:eastAsia="나눔명조" w:cs="나눔명조"/>
-                <w:b w:val="0"/>
+                <w:rFonts w:ascii="나눔명조" w:eastAsia="나눔명조" w:hAnsi="나눔명조" w:cs="나눔명조"/>
                 <w:color w:val="000000"/>
                 <w:sz w:val="22"/>
               </w:rPr>
@@ -1473,7 +1399,6 @@
           </w:p>
           <w:p>
             <w:pPr>
-              <w:jc w:val="both"/>
               <w:rPr>
                 <w:rFonts w:ascii="나눔명조" w:eastAsia="나눔명조" w:hAnsi="나눔명조" w:cs="KoPubWorld바탕체 Medium"/>
                 <w:b/>
@@ -1483,7 +1408,7 @@
             </w:pPr>
             <w:r>
               <w:rPr>
-                <w:rFonts w:ascii="나눔명조" w:hAnsi="나눔명조" w:eastAsia="나눔명조" w:cs="나눔명조"/>
+                <w:rFonts w:ascii="나눔명조" w:eastAsia="나눔명조" w:hAnsi="나눔명조" w:cs="나눔명조"/>
                 <w:b/>
                 <w:color w:val="000000"/>
                 <w:sz w:val="22"/>
@@ -1492,8 +1417,7 @@
             </w:r>
             <w:r>
               <w:rPr>
-                <w:rFonts w:ascii="나눔명조" w:hAnsi="나눔명조" w:eastAsia="나눔명조" w:cs="나눔명조"/>
-                <w:b w:val="0"/>
+                <w:rFonts w:ascii="나눔명조" w:eastAsia="나눔명조" w:hAnsi="나눔명조" w:cs="나눔명조"/>
                 <w:color w:val="000000"/>
                 <w:sz w:val="22"/>
               </w:rPr>
@@ -1502,7 +1426,6 @@
           </w:p>
           <w:p>
             <w:pPr>
-              <w:jc w:val="both"/>
               <w:rPr>
                 <w:rFonts w:ascii="나눔명조" w:eastAsia="나눔명조" w:hAnsi="나눔명조" w:cs="KoPubWorld바탕체 Medium"/>
                 <w:b/>
@@ -1512,7 +1435,7 @@
             </w:pPr>
             <w:r>
               <w:rPr>
-                <w:rFonts w:ascii="나눔명조" w:hAnsi="나눔명조" w:eastAsia="나눔명조" w:cs="나눔명조"/>
+                <w:rFonts w:ascii="나눔명조" w:eastAsia="나눔명조" w:hAnsi="나눔명조" w:cs="나눔명조"/>
                 <w:b/>
                 <w:color w:val="000000"/>
                 <w:sz w:val="22"/>
@@ -1521,8 +1444,7 @@
             </w:r>
             <w:r>
               <w:rPr>
-                <w:rFonts w:ascii="나눔명조" w:hAnsi="나눔명조" w:eastAsia="나눔명조" w:cs="나눔명조"/>
-                <w:b w:val="0"/>
+                <w:rFonts w:ascii="나눔명조" w:eastAsia="나눔명조" w:hAnsi="나눔명조" w:cs="나눔명조"/>
                 <w:color w:val="000000"/>
                 <w:sz w:val="22"/>
               </w:rPr>
@@ -1531,7 +1453,6 @@
           </w:p>
           <w:p>
             <w:pPr>
-              <w:jc w:val="both"/>
               <w:rPr>
                 <w:rFonts w:ascii="나눔명조" w:eastAsia="나눔명조" w:hAnsi="나눔명조" w:cs="KoPubWorld바탕체 Medium"/>
                 <w:b/>
@@ -1541,7 +1462,7 @@
             </w:pPr>
             <w:r>
               <w:rPr>
-                <w:rFonts w:ascii="나눔명조" w:hAnsi="나눔명조" w:eastAsia="나눔명조" w:cs="나눔명조"/>
+                <w:rFonts w:ascii="나눔명조" w:eastAsia="나눔명조" w:hAnsi="나눔명조" w:cs="나눔명조"/>
                 <w:b/>
                 <w:color w:val="000000"/>
                 <w:sz w:val="22"/>
@@ -1550,8 +1471,7 @@
             </w:r>
             <w:r>
               <w:rPr>
-                <w:rFonts w:ascii="나눔명조" w:hAnsi="나눔명조" w:eastAsia="나눔명조" w:cs="나눔명조"/>
-                <w:b w:val="0"/>
+                <w:rFonts w:ascii="나눔명조" w:eastAsia="나눔명조" w:hAnsi="나눔명조" w:cs="나눔명조"/>
                 <w:color w:val="000000"/>
                 <w:sz w:val="22"/>
               </w:rPr>
@@ -1560,7 +1480,6 @@
           </w:p>
           <w:p>
             <w:pPr>
-              <w:jc w:val="both"/>
               <w:rPr>
                 <w:rFonts w:ascii="나눔명조" w:eastAsia="나눔명조" w:hAnsi="나눔명조" w:cs="KoPubWorld바탕체 Medium"/>
                 <w:b/>
@@ -1570,7 +1489,7 @@
             </w:pPr>
             <w:r>
               <w:rPr>
-                <w:rFonts w:ascii="나눔명조" w:hAnsi="나눔명조" w:eastAsia="나눔명조" w:cs="나눔명조"/>
+                <w:rFonts w:ascii="나눔명조" w:eastAsia="나눔명조" w:hAnsi="나눔명조" w:cs="나눔명조"/>
                 <w:b/>
                 <w:color w:val="000000"/>
                 <w:sz w:val="22"/>
@@ -1579,8 +1498,7 @@
             </w:r>
             <w:r>
               <w:rPr>
-                <w:rFonts w:ascii="나눔명조" w:hAnsi="나눔명조" w:eastAsia="나눔명조" w:cs="나눔명조"/>
-                <w:b w:val="0"/>
+                <w:rFonts w:ascii="나눔명조" w:eastAsia="나눔명조" w:hAnsi="나눔명조" w:cs="나눔명조"/>
                 <w:color w:val="000000"/>
                 <w:sz w:val="22"/>
               </w:rPr>
@@ -1595,7 +1513,7 @@
         <w:pStyle w:val="a4"/>
         <w:spacing w:line="240" w:lineRule="auto"/>
         <w:rPr>
-          <w:rFonts w:ascii="나눔명조" w:eastAsia="나눔명조" w:hAnsi="나눔명조" w:cs="KoPubWorld바탕체 Medium" w:hint="eastAsia"/>
+          <w:rFonts w:ascii="나눔명조" w:eastAsia="나눔명조" w:hAnsi="나눔명조" w:cs="KoPubWorld바탕체 Medium"/>
           <w:color w:val="0000FF"/>
           <w:sz w:val="26"/>
           <w:szCs w:val="26"/>
@@ -1603,7 +1521,7 @@
       </w:pPr>
     </w:p>
     <w:sectPr>
-      <w:footerReference w:type="default" r:id="rId7"/>
+      <w:footerReference w:type="default" r:id="rId10"/>
       <w:pgSz w:w="11906" w:h="16838"/>
       <w:pgMar w:top="1701" w:right="1440" w:bottom="1440" w:left="1440" w:header="851" w:footer="283" w:gutter="0"/>
       <w:cols w:space="425"/>
@@ -2157,6 +2075,7 @@
   <w:style w:type="character" w:default="1" w:styleId="a0">
     <w:name w:val="Default Paragraph Font"/>
     <w:uiPriority w:val="1"/>
+    <w:semiHidden/>
     <w:unhideWhenUsed/>
   </w:style>
   <w:style w:type="table" w:default="1" w:styleId="a1">

</xml_diff>